<commit_message>
Correccion liquidaciones, confirmacion de gastos agregados y otros arreglos
</commit_message>
<xml_diff>
--- a/public/templates/inquilino-recibi-template.docx
+++ b/public/templates/inquilino-recibi-template.docx
@@ -4,6 +4,8 @@
   <w:body>
     <w:p>
       <w:pPr>
+        <w:ind w:firstLine="720"/>
+        <w:jc w:val="right"/>
         <w:rPr>
           <w:rFonts w:ascii="Arial" w:hAnsi="Arial" w:cs="Arial"/>
           <w:sz w:val="28"/>
@@ -92,12 +94,20 @@
           <w:sz w:val="28"/>
           <w:szCs w:val="28"/>
         </w:rPr>
-        <w:t xml:space="preserve"> del/la señor/a {</w:t>
-      </w:r>
-      <w:r>
-        <w:rPr>
-          <w:rFonts w:ascii="Arial" w:hAnsi="Arial" w:cs="Arial"/>
-          <w:sz w:val="28"/>
+        <w:t xml:space="preserve"> del/la señor/a </w:t>
+      </w:r>
+      <w:r>
+        <w:rPr>
+          <w:rFonts w:ascii="Arial" w:hAnsi="Arial" w:cs="Arial"/>
+          <w:sz w:val="32"/>
+          <w:szCs w:val="28"/>
+        </w:rPr>
+        <w:t>{</w:t>
+      </w:r>
+      <w:r>
+        <w:rPr>
+          <w:rFonts w:ascii="Arial" w:hAnsi="Arial" w:cs="Arial"/>
+          <w:sz w:val="32"/>
           <w:szCs w:val="28"/>
         </w:rPr>
         <w:t>inquilino</w:t>
@@ -105,34 +115,26 @@
       <w:r>
         <w:rPr>
           <w:rFonts w:ascii="Arial" w:hAnsi="Arial" w:cs="Arial"/>
-          <w:sz w:val="28"/>
-          <w:szCs w:val="28"/>
-        </w:rPr>
-        <w:t xml:space="preserve">}, </w:t>
-      </w:r>
-      <w:r>
-        <w:rPr>
-          <w:rFonts w:ascii="Arial" w:hAnsi="Arial" w:cs="Arial"/>
-          <w:sz w:val="28"/>
-          <w:szCs w:val="28"/>
-        </w:rPr>
-        <w:t xml:space="preserve">en concepto de </w:t>
-      </w:r>
-      <w:r>
-        <w:rPr>
-          <w:rFonts w:ascii="Arial" w:hAnsi="Arial" w:cs="Arial"/>
-          <w:sz w:val="28"/>
-          <w:szCs w:val="28"/>
-        </w:rPr>
-        <w:t xml:space="preserve">pago </w:t>
-      </w:r>
-      <w:r>
-        <w:rPr>
-          <w:rFonts w:ascii="Arial" w:hAnsi="Arial" w:cs="Arial"/>
-          <w:sz w:val="28"/>
-          <w:szCs w:val="28"/>
-        </w:rPr>
-        <w:t>del alquiler</w:t>
+          <w:sz w:val="32"/>
+          <w:szCs w:val="28"/>
+        </w:rPr>
+        <w:t>}</w:t>
+      </w:r>
+      <w:r>
+        <w:rPr>
+          <w:rFonts w:ascii="Arial" w:hAnsi="Arial" w:cs="Arial"/>
+          <w:sz w:val="28"/>
+          <w:szCs w:val="28"/>
+        </w:rPr>
+        <w:t xml:space="preserve">, </w:t>
+      </w:r>
+      <w:r>
+        <w:rPr>
+          <w:rFonts w:ascii="Arial" w:hAnsi="Arial" w:cs="Arial"/>
+          <w:sz w:val="28"/>
+          <w:szCs w:val="28"/>
+        </w:rPr>
+        <w:t>la suma de</w:t>
       </w:r>
       <w:r>
         <w:rPr>
@@ -145,33 +147,25 @@
       <w:r>
         <w:rPr>
           <w:rFonts w:ascii="Arial" w:hAnsi="Arial" w:cs="Arial"/>
-          <w:sz w:val="28"/>
-          <w:szCs w:val="28"/>
-        </w:rPr>
-        <w:t xml:space="preserve">sito en </w:t>
-      </w:r>
-      <w:r>
-        <w:rPr>
-          <w:rFonts w:ascii="Arial" w:hAnsi="Arial" w:cs="Arial"/>
-          <w:sz w:val="28"/>
-          <w:szCs w:val="28"/>
-        </w:rPr>
-        <w:t>{</w:t>
+          <w:sz w:val="32"/>
+          <w:szCs w:val="28"/>
+        </w:rPr>
+        <w:t>pesos {</w:t>
       </w:r>
       <w:proofErr w:type="spellStart"/>
       <w:r>
         <w:rPr>
           <w:rFonts w:ascii="Arial" w:hAnsi="Arial" w:cs="Arial"/>
-          <w:sz w:val="28"/>
-          <w:szCs w:val="28"/>
-        </w:rPr>
-        <w:t>direccion</w:t>
+          <w:sz w:val="32"/>
+          <w:szCs w:val="28"/>
+        </w:rPr>
+        <w:t>montoAlquilerTexto</w:t>
       </w:r>
       <w:proofErr w:type="spellEnd"/>
       <w:r>
         <w:rPr>
           <w:rFonts w:ascii="Arial" w:hAnsi="Arial" w:cs="Arial"/>
-          <w:sz w:val="28"/>
+          <w:sz w:val="32"/>
           <w:szCs w:val="28"/>
         </w:rPr>
         <w:t>}</w:t>
@@ -179,47 +173,7 @@
       <w:r>
         <w:rPr>
           <w:rFonts w:ascii="Arial" w:hAnsi="Arial" w:cs="Arial"/>
-          <w:sz w:val="28"/>
-          <w:szCs w:val="28"/>
-        </w:rPr>
-        <w:t xml:space="preserve">, </w:t>
-      </w:r>
-      <w:r>
-        <w:rPr>
-          <w:rFonts w:ascii="Arial" w:hAnsi="Arial" w:cs="Arial"/>
-          <w:sz w:val="28"/>
-          <w:szCs w:val="28"/>
-        </w:rPr>
-        <w:t>{</w:t>
-      </w:r>
-      <w:r>
-        <w:rPr>
-          <w:rFonts w:ascii="Arial" w:hAnsi="Arial" w:cs="Arial"/>
-          <w:sz w:val="28"/>
-          <w:szCs w:val="28"/>
-        </w:rPr>
-        <w:t>piso</w:t>
-      </w:r>
-      <w:r>
-        <w:rPr>
-          <w:rFonts w:ascii="Arial" w:hAnsi="Arial" w:cs="Arial"/>
-          <w:sz w:val="28"/>
-          <w:szCs w:val="28"/>
-        </w:rPr>
-        <w:t>}</w:t>
-      </w:r>
-      <w:r>
-        <w:rPr>
-          <w:rFonts w:ascii="Arial" w:hAnsi="Arial" w:cs="Arial"/>
-          <w:sz w:val="28"/>
-          <w:szCs w:val="28"/>
-        </w:rPr>
-        <w:t>,</w:t>
-      </w:r>
-      <w:r>
-        <w:rPr>
-          <w:rFonts w:ascii="Arial" w:hAnsi="Arial" w:cs="Arial"/>
-          <w:sz w:val="28"/>
+          <w:sz w:val="32"/>
           <w:szCs w:val="28"/>
         </w:rPr>
         <w:t xml:space="preserve"> </w:t>
@@ -227,10 +181,18 @@
       <w:r>
         <w:rPr>
           <w:rFonts w:ascii="Arial" w:hAnsi="Arial" w:cs="Arial"/>
-          <w:sz w:val="28"/>
-          <w:szCs w:val="28"/>
-        </w:rPr>
-        <w:t>la suma de $</w:t>
+          <w:sz w:val="32"/>
+          <w:szCs w:val="28"/>
+        </w:rPr>
+        <w:t>(</w:t>
+      </w:r>
+      <w:r>
+        <w:rPr>
+          <w:rFonts w:ascii="Arial" w:hAnsi="Arial" w:cs="Arial"/>
+          <w:sz w:val="28"/>
+          <w:szCs w:val="28"/>
+        </w:rPr>
+        <w:t>$</w:t>
       </w:r>
       <w:r>
         <w:rPr>
@@ -274,15 +236,49 @@
           <w:sz w:val="28"/>
           <w:szCs w:val="28"/>
         </w:rPr>
-        <w:t>, en</w:t>
-      </w:r>
-      <w:r>
-        <w:rPr>
-          <w:rFonts w:ascii="Arial" w:hAnsi="Arial" w:cs="Arial"/>
-          <w:sz w:val="28"/>
-          <w:szCs w:val="28"/>
-        </w:rPr>
-        <w:t xml:space="preserve"> la ciudad de Mar del Plata, correspondiente al período</w:t>
+        <w:t>) en concepto de pago de alquiler de inmueble sito en calle {</w:t>
+      </w:r>
+      <w:proofErr w:type="spellStart"/>
+      <w:r>
+        <w:rPr>
+          <w:rFonts w:ascii="Arial" w:hAnsi="Arial" w:cs="Arial"/>
+          <w:sz w:val="28"/>
+          <w:szCs w:val="28"/>
+        </w:rPr>
+        <w:t>direccion</w:t>
+      </w:r>
+      <w:proofErr w:type="spellEnd"/>
+      <w:r>
+        <w:rPr>
+          <w:rFonts w:ascii="Arial" w:hAnsi="Arial" w:cs="Arial"/>
+          <w:sz w:val="28"/>
+          <w:szCs w:val="28"/>
+        </w:rPr>
+        <w:t>}, piso {piso}</w:t>
+      </w:r>
+      <w:r>
+        <w:rPr>
+          <w:rFonts w:ascii="Arial" w:hAnsi="Arial" w:cs="Arial"/>
+          <w:sz w:val="28"/>
+          <w:szCs w:val="28"/>
+        </w:rPr>
+        <w:t xml:space="preserve">, </w:t>
+      </w:r>
+      <w:r>
+        <w:rPr>
+          <w:rFonts w:ascii="Arial" w:hAnsi="Arial" w:cs="Arial"/>
+          <w:sz w:val="28"/>
+          <w:szCs w:val="28"/>
+        </w:rPr>
+        <w:t xml:space="preserve">de </w:t>
+      </w:r>
+      <w:r>
+        <w:rPr>
+          <w:rFonts w:ascii="Arial" w:hAnsi="Arial" w:cs="Arial"/>
+          <w:sz w:val="28"/>
+          <w:szCs w:val="28"/>
+        </w:rPr>
+        <w:t>la ciudad de Mar del Plata, correspondiente al período</w:t>
       </w:r>
       <w:r>
         <w:rPr>
@@ -391,6 +387,96 @@
     </w:p>
     <w:p>
       <w:pPr>
+        <w:jc w:val="right"/>
+      </w:pPr>
+    </w:p>
+    <w:p>
+      <w:pPr>
+        <w:ind w:left="3600" w:firstLine="720"/>
+        <w:jc w:val="right"/>
+        <w:rPr>
+          <w:rFonts w:ascii="Arial" w:hAnsi="Arial" w:cs="Arial"/>
+          <w:sz w:val="28"/>
+        </w:rPr>
+      </w:pPr>
+    </w:p>
+    <w:p>
+      <w:pPr>
+        <w:ind w:left="3600" w:firstLine="720"/>
+        <w:jc w:val="right"/>
+        <w:rPr>
+          <w:rFonts w:ascii="Arial" w:hAnsi="Arial" w:cs="Arial"/>
+          <w:sz w:val="28"/>
+        </w:rPr>
+      </w:pPr>
+      <w:r>
+        <w:rPr>
+          <w:rFonts w:ascii="Arial" w:hAnsi="Arial" w:cs="Arial"/>
+          <w:sz w:val="28"/>
+        </w:rPr>
+        <w:t>{#</w:t>
+      </w:r>
+      <w:proofErr w:type="spellStart"/>
+      <w:r>
+        <w:rPr>
+          <w:rFonts w:ascii="Arial" w:hAnsi="Arial" w:cs="Arial"/>
+          <w:sz w:val="28"/>
+        </w:rPr>
+        <w:t>itemsInquilino</w:t>
+      </w:r>
+      <w:proofErr w:type="spellEnd"/>
+      <w:r>
+        <w:rPr>
+          <w:rFonts w:ascii="Arial" w:hAnsi="Arial" w:cs="Arial"/>
+          <w:sz w:val="28"/>
+        </w:rPr>
+        <w:t>}</w:t>
+      </w:r>
+    </w:p>
+    <w:p>
+      <w:pPr>
+        <w:ind w:left="3600" w:firstLine="720"/>
+        <w:jc w:val="right"/>
+        <w:rPr>
+          <w:rFonts w:ascii="Arial" w:hAnsi="Arial" w:cs="Arial"/>
+          <w:sz w:val="28"/>
+          <w:szCs w:val="28"/>
+        </w:rPr>
+      </w:pPr>
+      <w:r>
+        <w:rPr>
+          <w:rFonts w:ascii="Arial" w:hAnsi="Arial" w:cs="Arial"/>
+          <w:sz w:val="28"/>
+        </w:rPr>
+        <w:t xml:space="preserve"> </w:t>
+      </w:r>
+      <w:r>
+        <w:rPr>
+          <w:rFonts w:ascii="Arial" w:hAnsi="Arial" w:cs="Arial"/>
+          <w:sz w:val="28"/>
+          <w:szCs w:val="28"/>
+        </w:rPr>
+        <w:t>Mar del Plata</w:t>
+      </w:r>
+      <w:r>
+        <w:rPr>
+          <w:rFonts w:ascii="Arial" w:hAnsi="Arial" w:cs="Arial"/>
+          <w:sz w:val="28"/>
+          <w:szCs w:val="28"/>
+        </w:rPr>
+        <w:t xml:space="preserve">, </w:t>
+      </w:r>
+      <w:r>
+        <w:rPr>
+          <w:rFonts w:ascii="Arial" w:hAnsi="Arial" w:cs="Arial"/>
+          <w:sz w:val="28"/>
+          <w:szCs w:val="28"/>
+        </w:rPr>
+        <w:t>{periodo}</w:t>
+      </w:r>
+    </w:p>
+    <w:p>
+      <w:pPr>
         <w:jc w:val="both"/>
         <w:rPr>
           <w:rFonts w:ascii="Arial" w:hAnsi="Arial" w:cs="Arial"/>
@@ -419,303 +505,44 @@
         </w:rPr>
       </w:pPr>
     </w:p>
-    <w:p/>
-    <w:p>
-      <w:pPr>
-        <w:ind w:left="3600" w:firstLine="720"/>
-        <w:rPr>
-          <w:rFonts w:ascii="Arial" w:hAnsi="Arial" w:cs="Arial"/>
-          <w:sz w:val="28"/>
-          <w:szCs w:val="28"/>
-        </w:rPr>
-      </w:pPr>
-      <w:r>
-        <w:rPr>
-          <w:rFonts w:ascii="Arial" w:hAnsi="Arial" w:cs="Arial"/>
-          <w:sz w:val="28"/>
-          <w:szCs w:val="28"/>
-        </w:rPr>
-        <w:t>Mar del Plata</w:t>
-      </w:r>
-      <w:r>
-        <w:rPr>
-          <w:rFonts w:ascii="Arial" w:hAnsi="Arial" w:cs="Arial"/>
-          <w:sz w:val="28"/>
-          <w:szCs w:val="28"/>
-        </w:rPr>
-        <w:t xml:space="preserve">, </w:t>
-      </w:r>
-      <w:r>
-        <w:rPr>
-          <w:rFonts w:ascii="Arial" w:hAnsi="Arial" w:cs="Arial"/>
-          <w:sz w:val="28"/>
-          <w:szCs w:val="28"/>
-        </w:rPr>
-        <w:t>{periodo}</w:t>
-      </w:r>
-    </w:p>
     <w:p>
       <w:pPr>
         <w:jc w:val="both"/>
         <w:rPr>
-          <w:rFonts w:ascii="Arial" w:hAnsi="Arial" w:cs="Arial"/>
-          <w:sz w:val="28"/>
-          <w:szCs w:val="28"/>
-        </w:rPr>
-      </w:pPr>
-    </w:p>
-    <w:p>
-      <w:pPr>
-        <w:jc w:val="both"/>
-        <w:rPr>
-          <w:rFonts w:ascii="Arial" w:hAnsi="Arial" w:cs="Arial"/>
-          <w:sz w:val="28"/>
-          <w:szCs w:val="28"/>
-        </w:rPr>
-      </w:pPr>
-    </w:p>
-    <w:p>
-      <w:pPr>
-        <w:jc w:val="both"/>
-        <w:rPr>
-          <w:rFonts w:ascii="Arial" w:hAnsi="Arial" w:cs="Arial"/>
-          <w:sz w:val="28"/>
-          <w:szCs w:val="28"/>
-        </w:rPr>
-      </w:pPr>
-    </w:p>
-    <w:p>
-      <w:pPr>
-        <w:jc w:val="both"/>
-        <w:rPr>
-          <w:rFonts w:ascii="Arial" w:hAnsi="Arial" w:cs="Arial"/>
-          <w:sz w:val="28"/>
-          <w:szCs w:val="28"/>
-        </w:rPr>
-      </w:pPr>
-      <w:r>
-        <w:rPr>
-          <w:rFonts w:ascii="Arial" w:hAnsi="Arial" w:cs="Arial"/>
-          <w:sz w:val="28"/>
-          <w:szCs w:val="28"/>
-        </w:rPr>
-        <w:t>Recibí</w:t>
-      </w:r>
-      <w:r>
-        <w:rPr>
-          <w:rFonts w:ascii="Arial" w:hAnsi="Arial" w:cs="Arial"/>
-          <w:sz w:val="28"/>
-          <w:szCs w:val="28"/>
-        </w:rPr>
-        <w:t xml:space="preserve"> del/la señor/a {inquilino}</w:t>
-      </w:r>
-      <w:r>
-        <w:rPr>
-          <w:rFonts w:ascii="Arial" w:hAnsi="Arial" w:cs="Arial"/>
-          <w:sz w:val="28"/>
-          <w:szCs w:val="28"/>
-        </w:rPr>
-        <w:t xml:space="preserve">, </w:t>
-      </w:r>
-      <w:r>
-        <w:rPr>
-          <w:rFonts w:ascii="Arial" w:hAnsi="Arial" w:cs="Arial"/>
-          <w:sz w:val="28"/>
-          <w:szCs w:val="28"/>
-        </w:rPr>
-        <w:t>en concepto</w:t>
-      </w:r>
-      <w:r>
-        <w:rPr>
-          <w:rFonts w:ascii="Arial" w:hAnsi="Arial" w:cs="Arial"/>
-          <w:sz w:val="28"/>
-          <w:szCs w:val="28"/>
-        </w:rPr>
-        <w:t xml:space="preserve"> </w:t>
-      </w:r>
-      <w:r>
-        <w:rPr>
-          <w:rFonts w:ascii="Arial" w:hAnsi="Arial" w:cs="Arial"/>
-          <w:sz w:val="28"/>
-          <w:szCs w:val="28"/>
-        </w:rPr>
-        <w:t>de pago</w:t>
-      </w:r>
-      <w:r>
-        <w:rPr>
-          <w:rFonts w:ascii="Arial" w:hAnsi="Arial" w:cs="Arial"/>
-          <w:sz w:val="28"/>
-          <w:szCs w:val="28"/>
-        </w:rPr>
-        <w:t xml:space="preserve"> de</w:t>
-      </w:r>
-      <w:r>
-        <w:rPr>
-          <w:rFonts w:ascii="Arial" w:hAnsi="Arial" w:cs="Arial"/>
-          <w:sz w:val="28"/>
-          <w:szCs w:val="28"/>
-        </w:rPr>
-        <w:t xml:space="preserve"> </w:t>
-      </w:r>
-      <w:r>
-        <w:rPr>
-          <w:rFonts w:ascii="Arial" w:hAnsi="Arial" w:cs="Arial"/>
-          <w:sz w:val="28"/>
-          <w:szCs w:val="28"/>
-        </w:rPr>
-        <w:t>{#</w:t>
+          <w:rStyle w:val="Textoennegrita"/>
+          <w:rFonts w:ascii="Arial" w:hAnsi="Arial" w:cs="Arial"/>
+          <w:sz w:val="28"/>
+        </w:rPr>
+      </w:pPr>
+      <w:r>
+        <w:rPr>
+          <w:rFonts w:ascii="Arial" w:hAnsi="Arial" w:cs="Arial"/>
+          <w:sz w:val="28"/>
+        </w:rPr>
+        <w:t xml:space="preserve">Recibí del/la señor/a {inquilino}, la suma de </w:t>
+      </w:r>
+      <w:r>
+        <w:rPr>
+          <w:rFonts w:ascii="Arial" w:hAnsi="Arial" w:cs="Arial"/>
+          <w:sz w:val="32"/>
+        </w:rPr>
+        <w:t>pesos {</w:t>
       </w:r>
       <w:proofErr w:type="spellStart"/>
       <w:r>
         <w:rPr>
           <w:rFonts w:ascii="Arial" w:hAnsi="Arial" w:cs="Arial"/>
-          <w:sz w:val="28"/>
-          <w:szCs w:val="28"/>
-        </w:rPr>
-        <w:t>itemsInquilino</w:t>
+          <w:sz w:val="32"/>
+        </w:rPr>
+        <w:t>montoTexto</w:t>
       </w:r>
       <w:proofErr w:type="spellEnd"/>
       <w:r>
         <w:rPr>
           <w:rFonts w:ascii="Arial" w:hAnsi="Arial" w:cs="Arial"/>
-          <w:sz w:val="28"/>
-          <w:szCs w:val="28"/>
-        </w:rPr>
-        <w:t>}{</w:t>
-      </w:r>
-      <w:proofErr w:type="spellStart"/>
-      <w:r>
-        <w:rPr>
-          <w:rFonts w:ascii="Arial" w:hAnsi="Arial" w:cs="Arial"/>
-          <w:sz w:val="28"/>
-          <w:szCs w:val="28"/>
-        </w:rPr>
-        <w:t>descripcion</w:t>
-      </w:r>
-      <w:proofErr w:type="spellEnd"/>
-      <w:r>
-        <w:rPr>
-          <w:rFonts w:ascii="Arial" w:hAnsi="Arial" w:cs="Arial"/>
-          <w:sz w:val="28"/>
-          <w:szCs w:val="28"/>
-        </w:rPr>
-        <w:t xml:space="preserve">}, </w:t>
-      </w:r>
-      <w:r>
-        <w:rPr>
-          <w:rFonts w:ascii="Arial" w:hAnsi="Arial" w:cs="Arial"/>
-          <w:sz w:val="28"/>
-          <w:szCs w:val="28"/>
-        </w:rPr>
-        <w:t>la suma de</w:t>
-      </w:r>
-      <w:r>
-        <w:rPr>
-          <w:rFonts w:ascii="Arial" w:hAnsi="Arial" w:cs="Arial"/>
-          <w:sz w:val="28"/>
-          <w:szCs w:val="28"/>
-        </w:rPr>
-        <w:t xml:space="preserve"> </w:t>
-      </w:r>
-      <w:r>
-        <w:rPr>
-          <w:rFonts w:ascii="Arial" w:hAnsi="Arial" w:cs="Arial"/>
-          <w:sz w:val="28"/>
-          <w:szCs w:val="28"/>
-        </w:rPr>
-        <w:t>$</w:t>
-      </w:r>
-      <w:r>
-        <w:rPr>
-          <w:rFonts w:ascii="Arial" w:hAnsi="Arial" w:cs="Arial"/>
-          <w:sz w:val="28"/>
-          <w:szCs w:val="28"/>
-        </w:rPr>
-        <w:t>{monto}{/</w:t>
-      </w:r>
-      <w:proofErr w:type="spellStart"/>
-      <w:r>
-        <w:rPr>
-          <w:rFonts w:ascii="Arial" w:hAnsi="Arial" w:cs="Arial"/>
-          <w:sz w:val="28"/>
-          <w:szCs w:val="28"/>
-        </w:rPr>
-        <w:t>itemsInquilino</w:t>
-      </w:r>
-      <w:proofErr w:type="spellEnd"/>
-      <w:r>
-        <w:rPr>
-          <w:rFonts w:ascii="Arial" w:hAnsi="Arial" w:cs="Arial"/>
-          <w:sz w:val="28"/>
-          <w:szCs w:val="28"/>
-        </w:rPr>
-        <w:t>}.-, según</w:t>
-      </w:r>
-      <w:r>
-        <w:rPr>
-          <w:rFonts w:ascii="Arial" w:hAnsi="Arial" w:cs="Arial"/>
-          <w:sz w:val="28"/>
-          <w:szCs w:val="28"/>
-        </w:rPr>
-        <w:t xml:space="preserve"> locación</w:t>
-      </w:r>
-      <w:r>
-        <w:rPr>
-          <w:rFonts w:ascii="Arial" w:hAnsi="Arial" w:cs="Arial"/>
-          <w:sz w:val="28"/>
-          <w:szCs w:val="28"/>
-        </w:rPr>
-        <w:t xml:space="preserve"> </w:t>
-      </w:r>
-      <w:r>
-        <w:rPr>
-          <w:rFonts w:ascii="Arial" w:hAnsi="Arial" w:cs="Arial"/>
-          <w:sz w:val="28"/>
-          <w:szCs w:val="28"/>
-        </w:rPr>
-        <w:t xml:space="preserve">que tiene por objeto al </w:t>
-      </w:r>
-      <w:r>
-        <w:rPr>
-          <w:rFonts w:ascii="Arial" w:hAnsi="Arial" w:cs="Arial"/>
-          <w:sz w:val="28"/>
-          <w:szCs w:val="28"/>
-        </w:rPr>
-        <w:t>inmueble sito en {</w:t>
-      </w:r>
-      <w:proofErr w:type="spellStart"/>
-      <w:r>
-        <w:rPr>
-          <w:rFonts w:ascii="Arial" w:hAnsi="Arial" w:cs="Arial"/>
-          <w:sz w:val="28"/>
-          <w:szCs w:val="28"/>
-        </w:rPr>
-        <w:t>direccion</w:t>
-      </w:r>
-      <w:proofErr w:type="spellEnd"/>
-      <w:r>
-        <w:rPr>
-          <w:rFonts w:ascii="Arial" w:hAnsi="Arial" w:cs="Arial"/>
-          <w:sz w:val="28"/>
-          <w:szCs w:val="28"/>
-        </w:rPr>
-        <w:t>}</w:t>
-      </w:r>
-      <w:r>
-        <w:rPr>
-          <w:rFonts w:ascii="Arial" w:hAnsi="Arial" w:cs="Arial"/>
-          <w:sz w:val="28"/>
-          <w:szCs w:val="28"/>
-        </w:rPr>
-        <w:t xml:space="preserve">, </w:t>
-      </w:r>
-      <w:r>
-        <w:rPr>
-          <w:rFonts w:ascii="Arial" w:hAnsi="Arial" w:cs="Arial"/>
-          <w:sz w:val="28"/>
-          <w:szCs w:val="28"/>
-        </w:rPr>
-        <w:t>{piso</w:t>
+          <w:sz w:val="32"/>
+        </w:rPr>
+        <w:t xml:space="preserve">} </w:t>
       </w:r>
       <w:bookmarkStart w:id="0" w:name="_GoBack"/>
       <w:bookmarkEnd w:id="0"/>
@@ -723,64 +550,92 @@
         <w:rPr>
           <w:rFonts w:ascii="Arial" w:hAnsi="Arial" w:cs="Arial"/>
           <w:sz w:val="28"/>
-          <w:szCs w:val="28"/>
+        </w:rPr>
+        <w:t>(${monto}.-), en concepto de pago de {</w:t>
+      </w:r>
+      <w:proofErr w:type="spellStart"/>
+      <w:r>
+        <w:rPr>
+          <w:rFonts w:ascii="Arial" w:hAnsi="Arial" w:cs="Arial"/>
+          <w:sz w:val="28"/>
+        </w:rPr>
+        <w:t>descripcion</w:t>
+      </w:r>
+      <w:proofErr w:type="spellEnd"/>
+      <w:r>
+        <w:rPr>
+          <w:rFonts w:ascii="Arial" w:hAnsi="Arial" w:cs="Arial"/>
+          <w:sz w:val="28"/>
+        </w:rPr>
+        <w:t>}, según locación que tiene por objeto al inmueble sito en calle {</w:t>
+      </w:r>
+      <w:proofErr w:type="spellStart"/>
+      <w:r>
+        <w:rPr>
+          <w:rFonts w:ascii="Arial" w:hAnsi="Arial" w:cs="Arial"/>
+          <w:sz w:val="28"/>
+        </w:rPr>
+        <w:t>direccion</w:t>
+      </w:r>
+      <w:proofErr w:type="spellEnd"/>
+      <w:r>
+        <w:rPr>
+          <w:rFonts w:ascii="Arial" w:hAnsi="Arial" w:cs="Arial"/>
+          <w:sz w:val="28"/>
+        </w:rPr>
+        <w:t>}, piso {piso}, de la ciudad de Mar del Plata.----------------------------------------------------------------------------------</w:t>
+      </w:r>
+      <w:r>
+        <w:rPr>
+          <w:rFonts w:ascii="Arial" w:hAnsi="Arial" w:cs="Arial"/>
+          <w:sz w:val="28"/>
+        </w:rPr>
+        <w:br/>
+      </w:r>
+    </w:p>
+    <w:p>
+      <w:pPr>
+        <w:jc w:val="both"/>
+        <w:rPr>
+          <w:rStyle w:val="Textoennegrita"/>
+          <w:rFonts w:ascii="Arial" w:hAnsi="Arial" w:cs="Arial"/>
+          <w:sz w:val="28"/>
+        </w:rPr>
+      </w:pPr>
+    </w:p>
+    <w:p>
+      <w:pPr>
+        <w:jc w:val="both"/>
+        <w:rPr>
+          <w:rFonts w:ascii="Arial" w:hAnsi="Arial" w:cs="Arial"/>
+          <w:sz w:val="28"/>
+        </w:rPr>
+      </w:pPr>
+      <w:r>
+        <w:rPr>
+          <w:rStyle w:val="Textoennegrita"/>
+          <w:rFonts w:ascii="Arial" w:hAnsi="Arial" w:cs="Arial"/>
+          <w:sz w:val="28"/>
+        </w:rPr>
+        <w:t>{/</w:t>
+      </w:r>
+      <w:proofErr w:type="spellStart"/>
+      <w:r>
+        <w:rPr>
+          <w:rStyle w:val="Textoennegrita"/>
+          <w:rFonts w:ascii="Arial" w:hAnsi="Arial" w:cs="Arial"/>
+          <w:sz w:val="28"/>
+        </w:rPr>
+        <w:t>itemsInquilino</w:t>
+      </w:r>
+      <w:proofErr w:type="spellEnd"/>
+      <w:r>
+        <w:rPr>
+          <w:rStyle w:val="Textoennegrita"/>
+          <w:rFonts w:ascii="Arial" w:hAnsi="Arial" w:cs="Arial"/>
+          <w:sz w:val="28"/>
         </w:rPr>
         <w:t>}</w:t>
-      </w:r>
-      <w:r>
-        <w:rPr>
-          <w:rFonts w:ascii="Arial" w:hAnsi="Arial" w:cs="Arial"/>
-          <w:sz w:val="28"/>
-          <w:szCs w:val="28"/>
-        </w:rPr>
-        <w:t>,</w:t>
-      </w:r>
-      <w:r>
-        <w:rPr>
-          <w:rFonts w:ascii="Arial" w:hAnsi="Arial" w:cs="Arial"/>
-          <w:sz w:val="28"/>
-          <w:szCs w:val="28"/>
-        </w:rPr>
-        <w:t xml:space="preserve"> </w:t>
-      </w:r>
-      <w:r>
-        <w:rPr>
-          <w:rFonts w:ascii="Arial" w:hAnsi="Arial" w:cs="Arial"/>
-          <w:sz w:val="28"/>
-          <w:szCs w:val="28"/>
-        </w:rPr>
-        <w:t>de la ciudad de Mar del Plata.</w:t>
-      </w:r>
-      <w:r>
-        <w:rPr>
-          <w:rFonts w:ascii="Arial" w:hAnsi="Arial" w:cs="Arial"/>
-          <w:sz w:val="28"/>
-          <w:szCs w:val="28"/>
-        </w:rPr>
-        <w:t>----------------------------------------------------------------------------------</w:t>
-      </w:r>
-    </w:p>
-    <w:p>
-      <w:pPr>
-        <w:jc w:val="both"/>
-        <w:rPr>
-          <w:rFonts w:ascii="Arial" w:hAnsi="Arial" w:cs="Arial"/>
-          <w:sz w:val="28"/>
-          <w:szCs w:val="28"/>
-        </w:rPr>
-      </w:pPr>
-    </w:p>
-    <w:p>
-      <w:pPr>
-        <w:jc w:val="right"/>
-      </w:pPr>
-      <w:r>
-        <w:rPr>
-          <w:rFonts w:ascii="Arial" w:hAnsi="Arial" w:cs="Arial"/>
-          <w:sz w:val="28"/>
-          <w:szCs w:val="28"/>
-        </w:rPr>
-        <w:t xml:space="preserve">                               </w:t>
       </w:r>
     </w:p>
     <w:sectPr>
@@ -1224,6 +1079,17 @@
     <w:semiHidden/>
     <w:unhideWhenUsed/>
   </w:style>
+  <w:style w:type="character" w:styleId="Textoennegrita">
+    <w:name w:val="Strong"/>
+    <w:basedOn w:val="Fuentedeprrafopredeter"/>
+    <w:uiPriority w:val="22"/>
+    <w:qFormat/>
+    <w:rsid w:val="0070169A"/>
+    <w:rPr>
+      <w:b/>
+      <w:bCs/>
+    </w:rPr>
+  </w:style>
 </w:styles>
 </file>
 

</xml_diff>

<commit_message>
creo q fueron arreglos
</commit_message>
<xml_diff>
--- a/public/templates/inquilino-recibi-template.docx
+++ b/public/templates/inquilino-recibi-template.docx
@@ -294,7 +294,15 @@
           <w:sz w:val="28"/>
           <w:szCs w:val="28"/>
         </w:rPr>
-        <w:t xml:space="preserve"> los días 01 de {</w:t>
+        <w:t xml:space="preserve"> los días </w:t>
+      </w:r>
+      <w:r>
+        <w:rPr>
+          <w:rFonts w:ascii="Arial" w:hAnsi="Arial" w:cs="Arial"/>
+          <w:sz w:val="28"/>
+          <w:szCs w:val="28"/>
+        </w:rPr>
+        <w:t>{</w:t>
       </w:r>
       <w:proofErr w:type="spellStart"/>
       <w:r>
@@ -303,6 +311,32 @@
           <w:sz w:val="28"/>
           <w:szCs w:val="28"/>
         </w:rPr>
+        <w:t>inicioDelPeriodo</w:t>
+      </w:r>
+      <w:proofErr w:type="spellEnd"/>
+      <w:r>
+        <w:rPr>
+          <w:rFonts w:ascii="Arial" w:hAnsi="Arial" w:cs="Arial"/>
+          <w:sz w:val="28"/>
+          <w:szCs w:val="28"/>
+        </w:rPr>
+        <w:t>}</w:t>
+      </w:r>
+      <w:r>
+        <w:rPr>
+          <w:rFonts w:ascii="Arial" w:hAnsi="Arial" w:cs="Arial"/>
+          <w:sz w:val="28"/>
+          <w:szCs w:val="28"/>
+        </w:rPr>
+        <w:t xml:space="preserve"> de {</w:t>
+      </w:r>
+      <w:proofErr w:type="spellStart"/>
+      <w:r>
+        <w:rPr>
+          <w:rFonts w:ascii="Arial" w:hAnsi="Arial" w:cs="Arial"/>
+          <w:sz w:val="28"/>
+          <w:szCs w:val="28"/>
+        </w:rPr>
         <w:t>mesYAnioActual</w:t>
       </w:r>
       <w:proofErr w:type="spellEnd"/>
@@ -312,7 +346,33 @@
           <w:sz w:val="28"/>
           <w:szCs w:val="28"/>
         </w:rPr>
-        <w:t>} y el día 01 de</w:t>
+        <w:t>} y el día</w:t>
+      </w:r>
+      <w:r>
+        <w:rPr>
+          <w:rFonts w:ascii="Arial" w:hAnsi="Arial" w:cs="Arial"/>
+          <w:sz w:val="28"/>
+          <w:szCs w:val="28"/>
+        </w:rPr>
+        <w:t xml:space="preserve"> {inicioDelPeriodo</w:t>
+      </w:r>
+      <w:bookmarkStart w:id="0" w:name="_GoBack"/>
+      <w:bookmarkEnd w:id="0"/>
+      <w:r>
+        <w:rPr>
+          <w:rFonts w:ascii="Arial" w:hAnsi="Arial" w:cs="Arial"/>
+          <w:sz w:val="28"/>
+          <w:szCs w:val="28"/>
+        </w:rPr>
+        <w:t>}</w:t>
+      </w:r>
+      <w:r>
+        <w:rPr>
+          <w:rFonts w:ascii="Arial" w:hAnsi="Arial" w:cs="Arial"/>
+          <w:sz w:val="28"/>
+          <w:szCs w:val="28"/>
+        </w:rPr>
+        <w:t xml:space="preserve"> de</w:t>
       </w:r>
       <w:r>
         <w:rPr>
@@ -544,8 +604,6 @@
         </w:rPr>
         <w:t xml:space="preserve">} </w:t>
       </w:r>
-      <w:bookmarkStart w:id="0" w:name="_GoBack"/>
-      <w:bookmarkEnd w:id="0"/>
       <w:r>
         <w:rPr>
           <w:rFonts w:ascii="Arial" w:hAnsi="Arial" w:cs="Arial"/>

</xml_diff>

<commit_message>
el commit anterior le correspondia estos cambios tmb xd
</commit_message>
<xml_diff>
--- a/public/templates/inquilino-recibi-template.docx
+++ b/public/templates/inquilino-recibi-template.docx
@@ -1,6 +1,6 @@
 
 <file path=word/document.xml><?xml version="1.0" encoding="utf-8"?>
-<w:document xmlns:wpc="http://schemas.microsoft.com/office/word/2010/wordprocessingCanvas" xmlns:cx="http://schemas.microsoft.com/office/drawing/2014/chartex" xmlns:mc="http://schemas.openxmlformats.org/markup-compatibility/2006" xmlns:o="urn:schemas-microsoft-com:office:office" xmlns:r="http://schemas.openxmlformats.org/officeDocument/2006/relationships" xmlns:m="http://schemas.openxmlformats.org/officeDocument/2006/math" xmlns:v="urn:schemas-microsoft-com:vml" xmlns:wp14="http://schemas.microsoft.com/office/word/2010/wordprocessingDrawing" xmlns:wp="http://schemas.openxmlformats.org/drawingml/2006/wordprocessingDrawing" xmlns:w10="urn:schemas-microsoft-com:office:word" xmlns:w="http://schemas.openxmlformats.org/wordprocessingml/2006/main" xmlns:w14="http://schemas.microsoft.com/office/word/2010/wordml" xmlns:w15="http://schemas.microsoft.com/office/word/2012/wordml" xmlns:w16se="http://schemas.microsoft.com/office/word/2015/wordml/symex" xmlns:wpg="http://schemas.microsoft.com/office/word/2010/wordprocessingGroup" xmlns:wpi="http://schemas.microsoft.com/office/word/2010/wordprocessingInk" xmlns:wne="http://schemas.microsoft.com/office/word/2006/wordml" xmlns:wps="http://schemas.microsoft.com/office/word/2010/wordprocessingShape" mc:Ignorable="w14 w15 w16se wp14">
+<w:document xmlns:wpc="http://schemas.microsoft.com/office/word/2010/wordprocessingCanvas" xmlns:cx="http://schemas.microsoft.com/office/drawing/2014/chartex" xmlns:cx1="http://schemas.microsoft.com/office/drawing/2015/9/8/chartex" xmlns:cx2="http://schemas.microsoft.com/office/drawing/2015/10/21/chartex" xmlns:cx3="http://schemas.microsoft.com/office/drawing/2016/5/9/chartex" xmlns:cx4="http://schemas.microsoft.com/office/drawing/2016/5/10/chartex" xmlns:cx5="http://schemas.microsoft.com/office/drawing/2016/5/11/chartex" xmlns:cx6="http://schemas.microsoft.com/office/drawing/2016/5/12/chartex" xmlns:cx7="http://schemas.microsoft.com/office/drawing/2016/5/13/chartex" xmlns:cx8="http://schemas.microsoft.com/office/drawing/2016/5/14/chartex" xmlns:mc="http://schemas.openxmlformats.org/markup-compatibility/2006" xmlns:aink="http://schemas.microsoft.com/office/drawing/2016/ink" xmlns:am3d="http://schemas.microsoft.com/office/drawing/2017/model3d" xmlns:o="urn:schemas-microsoft-com:office:office" xmlns:oel="http://schemas.microsoft.com/office/2019/extlst" xmlns:r="http://schemas.openxmlformats.org/officeDocument/2006/relationships" xmlns:m="http://schemas.openxmlformats.org/officeDocument/2006/math" xmlns:v="urn:schemas-microsoft-com:vml" xmlns:wp14="http://schemas.microsoft.com/office/word/2010/wordprocessingDrawing" xmlns:wp="http://schemas.openxmlformats.org/drawingml/2006/wordprocessingDrawing" xmlns:w10="urn:schemas-microsoft-com:office:word" xmlns:w="http://schemas.openxmlformats.org/wordprocessingml/2006/main" xmlns:w14="http://schemas.microsoft.com/office/word/2010/wordml" xmlns:w15="http://schemas.microsoft.com/office/word/2012/wordml" xmlns:w16cex="http://schemas.microsoft.com/office/word/2018/wordml/cex" xmlns:w16cid="http://schemas.microsoft.com/office/word/2016/wordml/cid" xmlns:w16="http://schemas.microsoft.com/office/word/2018/wordml" xmlns:w16du="http://schemas.microsoft.com/office/word/2023/wordml/word16du" xmlns:w16sdtdh="http://schemas.microsoft.com/office/word/2020/wordml/sdtdatahash" xmlns:w16sdtfl="http://schemas.microsoft.com/office/word/2024/wordml/sdtformatlock" xmlns:w16se="http://schemas.microsoft.com/office/word/2015/wordml/symex" xmlns:wpg="http://schemas.microsoft.com/office/word/2010/wordprocessingGroup" xmlns:wpi="http://schemas.microsoft.com/office/word/2010/wordprocessingInk" xmlns:wne="http://schemas.microsoft.com/office/word/2006/wordml" xmlns:wps="http://schemas.microsoft.com/office/word/2010/wordprocessingShape" mc:Ignorable="w14 w15 w16se w16cid w16 w16cex w16sdtdh w16sdtfl w16du wp14">
   <w:body>
     <w:p>
       <w:pPr>
@@ -354,10 +354,18 @@
           <w:sz w:val="28"/>
           <w:szCs w:val="28"/>
         </w:rPr>
-        <w:t xml:space="preserve"> {inicioDelPeriodo</w:t>
-      </w:r>
-      <w:bookmarkStart w:id="0" w:name="_GoBack"/>
-      <w:bookmarkEnd w:id="0"/>
+        <w:t xml:space="preserve"> {</w:t>
+      </w:r>
+      <w:proofErr w:type="spellStart"/>
+      <w:r>
+        <w:rPr>
+          <w:rFonts w:ascii="Arial" w:hAnsi="Arial" w:cs="Arial"/>
+          <w:sz w:val="28"/>
+          <w:szCs w:val="28"/>
+        </w:rPr>
+        <w:t>inicioDelPeriodo</w:t>
+      </w:r>
+      <w:proofErr w:type="spellEnd"/>
       <w:r>
         <w:rPr>
           <w:rFonts w:ascii="Arial" w:hAnsi="Arial" w:cs="Arial"/>
@@ -400,6 +408,7 @@
         <w:t>proximoMesYAnioActual</w:t>
       </w:r>
       <w:proofErr w:type="spellEnd"/>
+      <w:proofErr w:type="gramStart"/>
       <w:r>
         <w:rPr>
           <w:rFonts w:ascii="Arial" w:hAnsi="Arial" w:cs="Arial"/>
@@ -424,6 +433,7 @@
         </w:rPr>
         <w:t>----------------------------</w:t>
       </w:r>
+      <w:proofErr w:type="gramEnd"/>
     </w:p>
     <w:p>
       <w:pPr>
@@ -474,17 +484,8 @@
           <w:rFonts w:ascii="Arial" w:hAnsi="Arial" w:cs="Arial"/>
           <w:sz w:val="28"/>
         </w:rPr>
-        <w:t>{#</w:t>
-      </w:r>
-      <w:proofErr w:type="spellStart"/>
-      <w:r>
-        <w:rPr>
-          <w:rFonts w:ascii="Arial" w:hAnsi="Arial" w:cs="Arial"/>
-          <w:sz w:val="28"/>
-        </w:rPr>
-        <w:t>itemsInquilino</w:t>
-      </w:r>
-      <w:proofErr w:type="spellEnd"/>
+        <w:t>{#itemsInquilino</w:t>
+      </w:r>
       <w:r>
         <w:rPr>
           <w:rFonts w:ascii="Arial" w:hAnsi="Arial" w:cs="Arial"/>
@@ -569,8 +570,10 @@
       <w:pPr>
         <w:jc w:val="both"/>
         <w:rPr>
-          <w:rStyle w:val="Textoennegrita"/>
-          <w:rFonts w:ascii="Arial" w:hAnsi="Arial" w:cs="Arial"/>
+          <w:rStyle w:val="Fuerte"/>
+          <w:rFonts w:ascii="Arial" w:hAnsi="Arial" w:cs="Arial"/>
+          <w:b w:val="0"/>
+          <w:bCs w:val="0"/>
           <w:sz w:val="28"/>
         </w:rPr>
       </w:pPr>
@@ -609,7 +612,23 @@
           <w:rFonts w:ascii="Arial" w:hAnsi="Arial" w:cs="Arial"/>
           <w:sz w:val="28"/>
         </w:rPr>
-        <w:t>(${monto}.-), en concepto de pago de {</w:t>
+        <w:t>(${monto</w:t>
+      </w:r>
+      <w:proofErr w:type="gramStart"/>
+      <w:r>
+        <w:rPr>
+          <w:rFonts w:ascii="Arial" w:hAnsi="Arial" w:cs="Arial"/>
+          <w:sz w:val="28"/>
+        </w:rPr>
+        <w:t>}.-</w:t>
+      </w:r>
+      <w:proofErr w:type="gramEnd"/>
+      <w:r>
+        <w:rPr>
+          <w:rFonts w:ascii="Arial" w:hAnsi="Arial" w:cs="Arial"/>
+          <w:sz w:val="28"/>
+        </w:rPr>
+        <w:t>), en concepto de pago de {</w:t>
       </w:r>
       <w:proofErr w:type="spellStart"/>
       <w:r>
@@ -641,8 +660,31 @@
           <w:rFonts w:ascii="Arial" w:hAnsi="Arial" w:cs="Arial"/>
           <w:sz w:val="28"/>
         </w:rPr>
-        <w:t>}, piso {piso}, de la ciudad de Mar del Plata.----------------------------------------------------------------------------------</w:t>
-      </w:r>
+        <w:t>}, piso {piso}</w:t>
+      </w:r>
+      <w:r>
+        <w:rPr>
+          <w:rFonts w:ascii="Arial" w:hAnsi="Arial" w:cs="Arial"/>
+          <w:sz w:val="28"/>
+        </w:rPr>
+        <w:t>°, letra {letra}</w:t>
+      </w:r>
+      <w:r>
+        <w:rPr>
+          <w:rFonts w:ascii="Arial" w:hAnsi="Arial" w:cs="Arial"/>
+          <w:sz w:val="28"/>
+        </w:rPr>
+        <w:t xml:space="preserve">, de la ciudad de Mar del </w:t>
+      </w:r>
+      <w:proofErr w:type="gramStart"/>
+      <w:r>
+        <w:rPr>
+          <w:rFonts w:ascii="Arial" w:hAnsi="Arial" w:cs="Arial"/>
+          <w:sz w:val="28"/>
+        </w:rPr>
+        <w:t>Plata.----------------------------------------------------------------------------------</w:t>
+      </w:r>
+      <w:proofErr w:type="gramEnd"/>
       <w:r>
         <w:rPr>
           <w:rFonts w:ascii="Arial" w:hAnsi="Arial" w:cs="Arial"/>
@@ -655,7 +697,7 @@
       <w:pPr>
         <w:jc w:val="both"/>
         <w:rPr>
-          <w:rStyle w:val="Textoennegrita"/>
+          <w:rStyle w:val="Fuerte"/>
           <w:rFonts w:ascii="Arial" w:hAnsi="Arial" w:cs="Arial"/>
           <w:sz w:val="28"/>
         </w:rPr>
@@ -671,7 +713,7 @@
       </w:pPr>
       <w:r>
         <w:rPr>
-          <w:rStyle w:val="Textoennegrita"/>
+          <w:rStyle w:val="Fuerte"/>
           <w:rFonts w:ascii="Arial" w:hAnsi="Arial" w:cs="Arial"/>
           <w:sz w:val="28"/>
         </w:rPr>
@@ -680,7 +722,7 @@
       <w:proofErr w:type="spellStart"/>
       <w:r>
         <w:rPr>
-          <w:rStyle w:val="Textoennegrita"/>
+          <w:rStyle w:val="Fuerte"/>
           <w:rFonts w:ascii="Arial" w:hAnsi="Arial" w:cs="Arial"/>
           <w:sz w:val="28"/>
         </w:rPr>
@@ -689,7 +731,7 @@
       <w:proofErr w:type="spellEnd"/>
       <w:r>
         <w:rPr>
-          <w:rStyle w:val="Textoennegrita"/>
+          <w:rStyle w:val="Fuerte"/>
           <w:rFonts w:ascii="Arial" w:hAnsi="Arial" w:cs="Arial"/>
           <w:sz w:val="28"/>
         </w:rPr>
@@ -707,7 +749,7 @@
 </file>
 
 <file path=word/styles.xml><?xml version="1.0" encoding="utf-8"?>
-<w:styles xmlns:mc="http://schemas.openxmlformats.org/markup-compatibility/2006" xmlns:r="http://schemas.openxmlformats.org/officeDocument/2006/relationships" xmlns:w="http://schemas.openxmlformats.org/wordprocessingml/2006/main" xmlns:w14="http://schemas.microsoft.com/office/word/2010/wordml" xmlns:w15="http://schemas.microsoft.com/office/word/2012/wordml" xmlns:w16se="http://schemas.microsoft.com/office/word/2015/wordml/symex" mc:Ignorable="w14 w15 w16se">
+<w:styles xmlns:mc="http://schemas.openxmlformats.org/markup-compatibility/2006" xmlns:r="http://schemas.openxmlformats.org/officeDocument/2006/relationships" xmlns:w="http://schemas.openxmlformats.org/wordprocessingml/2006/main" xmlns:w14="http://schemas.microsoft.com/office/word/2010/wordml" xmlns:w15="http://schemas.microsoft.com/office/word/2012/wordml" xmlns:w16cex="http://schemas.microsoft.com/office/word/2018/wordml/cex" xmlns:w16cid="http://schemas.microsoft.com/office/word/2016/wordml/cid" xmlns:w16="http://schemas.microsoft.com/office/word/2018/wordml" xmlns:w16du="http://schemas.microsoft.com/office/word/2023/wordml/word16du" xmlns:w16sdtdh="http://schemas.microsoft.com/office/word/2020/wordml/sdtdatahash" xmlns:w16sdtfl="http://schemas.microsoft.com/office/word/2024/wordml/sdtformatlock" xmlns:w16se="http://schemas.microsoft.com/office/word/2015/wordml/symex" mc:Ignorable="w14 w15 w16se w16cid w16 w16cex w16sdtdh w16sdtfl w16du">
   <w:docDefaults>
     <w:rPrDefault>
       <w:rPr>
@@ -723,7 +765,7 @@
       </w:pPr>
     </w:pPrDefault>
   </w:docDefaults>
-  <w:latentStyles w:defLockedState="0" w:defUIPriority="99" w:defSemiHidden="0" w:defUnhideWhenUsed="0" w:defQFormat="0" w:count="371">
+  <w:latentStyles w:defLockedState="0" w:defUIPriority="99" w:defSemiHidden="0" w:defUnhideWhenUsed="0" w:defQFormat="0" w:count="376">
     <w:lsdException w:name="Normal" w:uiPriority="0" w:qFormat="1"/>
     <w:lsdException w:name="heading 1" w:uiPriority="9" w:qFormat="1"/>
     <w:lsdException w:name="heading 2" w:semiHidden="1" w:uiPriority="9" w:unhideWhenUsed="1" w:qFormat="1"/>
@@ -1095,6 +1137,11 @@
     <w:lsdException w:name="List Table 5 Dark Accent 6" w:uiPriority="50"/>
     <w:lsdException w:name="List Table 6 Colorful Accent 6" w:uiPriority="51"/>
     <w:lsdException w:name="List Table 7 Colorful Accent 6" w:uiPriority="52"/>
+    <w:lsdException w:name="Mention" w:semiHidden="1" w:unhideWhenUsed="1"/>
+    <w:lsdException w:name="Smart Hyperlink" w:semiHidden="1" w:unhideWhenUsed="1"/>
+    <w:lsdException w:name="Hashtag" w:semiHidden="1" w:unhideWhenUsed="1"/>
+    <w:lsdException w:name="Unresolved Mention" w:semiHidden="1" w:unhideWhenUsed="1"/>
+    <w:lsdException w:name="Smart Link" w:semiHidden="1" w:unhideWhenUsed="1"/>
   </w:latentStyles>
   <w:style w:type="paragraph" w:default="1" w:styleId="Normal">
     <w:name w:val="Normal"/>
@@ -1137,7 +1184,7 @@
     <w:semiHidden/>
     <w:unhideWhenUsed/>
   </w:style>
-  <w:style w:type="character" w:styleId="Textoennegrita">
+  <w:style w:type="character" w:styleId="Fuerte">
     <w:name w:val="Strong"/>
     <w:basedOn w:val="Fuentedeprrafopredeter"/>
     <w:uiPriority w:val="22"/>

</xml_diff>

<commit_message>
arreglo templates de liquidaciones y recibos
</commit_message>
<xml_diff>
--- a/public/templates/inquilino-recibi-template.docx
+++ b/public/templates/inquilino-recibi-template.docx
@@ -254,15 +254,49 @@
           <w:sz w:val="28"/>
           <w:szCs w:val="28"/>
         </w:rPr>
-        <w:t>}, piso {piso}</w:t>
-      </w:r>
-      <w:r>
-        <w:rPr>
-          <w:rFonts w:ascii="Arial" w:hAnsi="Arial" w:cs="Arial"/>
-          <w:sz w:val="28"/>
-          <w:szCs w:val="28"/>
-        </w:rPr>
-        <w:t xml:space="preserve">, </w:t>
+        <w:t>}, piso {piso</w:t>
+      </w:r>
+      <w:proofErr w:type="gramStart"/>
+      <w:r>
+        <w:rPr>
+          <w:rFonts w:ascii="Arial" w:hAnsi="Arial" w:cs="Arial"/>
+          <w:sz w:val="28"/>
+          <w:szCs w:val="28"/>
+        </w:rPr>
+        <w:t>}</w:t>
+      </w:r>
+      <w:r>
+        <w:rPr>
+          <w:rFonts w:ascii="Arial" w:hAnsi="Arial" w:cs="Arial"/>
+          <w:sz w:val="28"/>
+          <w:szCs w:val="28"/>
+        </w:rPr>
+        <w:t>,</w:t>
+      </w:r>
+      <w:r>
+        <w:rPr>
+          <w:rFonts w:ascii="Arial" w:hAnsi="Arial" w:cs="Arial"/>
+          <w:sz w:val="28"/>
+          <w:szCs w:val="28"/>
+        </w:rPr>
+        <w:t>letra</w:t>
+      </w:r>
+      <w:proofErr w:type="gramEnd"/>
+      <w:r>
+        <w:rPr>
+          <w:rFonts w:ascii="Arial" w:hAnsi="Arial" w:cs="Arial"/>
+          <w:sz w:val="28"/>
+          <w:szCs w:val="28"/>
+        </w:rPr>
+        <w:t xml:space="preserve"> “{letra}”</w:t>
+      </w:r>
+      <w:r>
+        <w:rPr>
+          <w:rFonts w:ascii="Arial" w:hAnsi="Arial" w:cs="Arial"/>
+          <w:sz w:val="28"/>
+          <w:szCs w:val="28"/>
+        </w:rPr>
+        <w:t xml:space="preserve"> </w:t>
       </w:r>
       <w:r>
         <w:rPr>
@@ -667,7 +701,28 @@
           <w:rFonts w:ascii="Arial" w:hAnsi="Arial" w:cs="Arial"/>
           <w:sz w:val="28"/>
         </w:rPr>
-        <w:t>°, letra {letra}</w:t>
+        <w:t xml:space="preserve">°, letra </w:t>
+      </w:r>
+      <w:r>
+        <w:rPr>
+          <w:rFonts w:ascii="Arial" w:hAnsi="Arial" w:cs="Arial"/>
+          <w:sz w:val="28"/>
+        </w:rPr>
+        <w:t>“</w:t>
+      </w:r>
+      <w:r>
+        <w:rPr>
+          <w:rFonts w:ascii="Arial" w:hAnsi="Arial" w:cs="Arial"/>
+          <w:sz w:val="28"/>
+        </w:rPr>
+        <w:t>{letra}</w:t>
+      </w:r>
+      <w:r>
+        <w:rPr>
+          <w:rFonts w:ascii="Arial" w:hAnsi="Arial" w:cs="Arial"/>
+          <w:sz w:val="28"/>
+        </w:rPr>
+        <w:t>”</w:t>
       </w:r>
       <w:r>
         <w:rPr>

</xml_diff>